<commit_message>
add RSS analysis cell
added Root Square Sum analysis cell to complement the Extreme Value Analysis Cell.
</commit_message>
<xml_diff>
--- a/Example.docx
+++ b/Example.docx
@@ -469,7 +469,6 @@
           <w:tcPr>
             <w:tcW w:w="0" w:type="auto"/>
           </w:tcPr>
-          <w:bookmarkStart w:id="1" w:name="_GoBack" w:colFirst="2" w:colLast="2"/>
           <w:p>
             <w:pPr>
               <w:pStyle w:val="Compact"/>
@@ -540,7 +539,6 @@
           </w:p>
         </w:tc>
       </w:tr>
-      <w:bookmarkEnd w:id="1"/>
     </w:tbl>
     <w:p/>
     <w:tbl>
@@ -551,13 +549,13 @@
         <w:tblLook w:val="0000" w:firstRow="0" w:lastRow="0" w:firstColumn="0" w:lastColumn="0" w:noHBand="0" w:noVBand="0"/>
       </w:tblPr>
       <w:tblGrid>
-        <w:gridCol w:w="6408"/>
-        <w:gridCol w:w="3168"/>
+        <w:gridCol w:w="7128"/>
+        <w:gridCol w:w="2448"/>
       </w:tblGrid>
       <w:tr>
         <w:tc>
           <w:tcPr>
-            <w:tcW w:w="6408" w:type="dxa"/>
+            <w:tcW w:w="7128" w:type="dxa"/>
           </w:tcPr>
           <w:p>
             <w:pPr>
@@ -929,7 +927,7 @@
         </w:tc>
         <w:tc>
           <w:tcPr>
-            <w:tcW w:w="3168" w:type="dxa"/>
+            <w:tcW w:w="2448" w:type="dxa"/>
           </w:tcPr>
           <w:p>
             <w:pPr>
@@ -1801,6 +1799,1010 @@
       <w:r>
         <w:t>- R_lower_as_variable: 46.8% - R_upper_as_variable: 23.4% - V_OS_as_variable: 14.6% - I_B_as_variable: 14.0% - I_OS_as_variable: 1.2%</w:t>
       </w:r>
+    </w:p>
+    <w:p>
+      <w:pPr>
+        <w:pStyle w:val="BodyText"/>
+        <w:rPr>
+          <w:b/>
+          <w:bCs/>
+        </w:rPr>
+      </w:pPr>
+    </w:p>
+    <w:p>
+      <w:pPr>
+        <w:pStyle w:val="BodyText"/>
+        <w:rPr>
+          <w:b/>
+          <w:bCs/>
+        </w:rPr>
+      </w:pPr>
+    </w:p>
+    <w:p>
+      <w:pPr>
+        <w:pStyle w:val="BodyText"/>
+      </w:pPr>
+      <w:bookmarkStart w:id="1" w:name="_GoBack"/>
+      <w:bookmarkEnd w:id="1"/>
+      <w:r>
+        <w:rPr>
+          <w:b/>
+          <w:bCs/>
+        </w:rPr>
+        <w:lastRenderedPageBreak/>
+        <w:t>Root Sum Square Analysis</w:t>
+      </w:r>
+    </w:p>
+    <w:p>
+      <w:pPr>
+        <w:pStyle w:val="BodyText"/>
+      </w:pPr>
+      <w:r>
+        <w:t xml:space="preserve">Query: </w:t>
+      </w:r>
+      <m:oMath>
+        <m:sSub>
+          <m:sSubPr>
+            <m:ctrlPr>
+              <w:rPr>
+                <w:rFonts w:ascii="Cambria Math" w:hAnsi="Cambria Math"/>
+              </w:rPr>
+            </m:ctrlPr>
+          </m:sSubPr>
+          <m:e>
+            <m:r>
+              <w:rPr>
+                <w:rFonts w:ascii="Cambria Math" w:hAnsi="Cambria Math"/>
+              </w:rPr>
+              <m:t>V</m:t>
+            </m:r>
+          </m:e>
+          <m:sub>
+            <m:r>
+              <w:rPr>
+                <w:rFonts w:ascii="Cambria Math" w:hAnsi="Cambria Math"/>
+              </w:rPr>
+              <m:t>OUT</m:t>
+            </m:r>
+          </m:sub>
+        </m:sSub>
+        <m:r>
+          <m:rPr>
+            <m:sty m:val="p"/>
+          </m:rPr>
+          <w:rPr>
+            <w:rFonts w:ascii="Cambria Math" w:hAnsi="Cambria Math"/>
+          </w:rPr>
+          <m:t>=</m:t>
+        </m:r>
+      </m:oMath>
+      <w:r>
+        <w:t xml:space="preserve"> </w:t>
+      </w:r>
+    </w:p>
+    <w:tbl>
+      <w:tblPr>
+        <w:tblStyle w:val="Table"/>
+        <w:tblW w:w="5000" w:type="pct"/>
+        <w:tblLayout w:type="fixed"/>
+        <w:tblLook w:val="0020" w:firstRow="1" w:lastRow="0" w:firstColumn="0" w:lastColumn="0" w:noHBand="0" w:noVBand="0"/>
+      </w:tblPr>
+      <w:tblGrid>
+        <w:gridCol w:w="3511"/>
+        <w:gridCol w:w="1596"/>
+        <w:gridCol w:w="2873"/>
+        <w:gridCol w:w="1596"/>
+      </w:tblGrid>
+      <w:tr>
+        <w:trPr>
+          <w:cnfStyle w:val="100000000000" w:firstRow="1" w:lastRow="0" w:firstColumn="0" w:lastColumn="0" w:oddVBand="0" w:evenVBand="0" w:oddHBand="0" w:evenHBand="0" w:firstRowFirstColumn="0" w:firstRowLastColumn="0" w:lastRowFirstColumn="0" w:lastRowLastColumn="0"/>
+          <w:tblHeader/>
+        </w:trPr>
+        <w:tc>
+          <w:tcPr>
+            <w:tcW w:w="2904" w:type="dxa"/>
+          </w:tcPr>
+          <w:p>
+            <w:pPr>
+              <w:pStyle w:val="Compact"/>
+            </w:pPr>
+            <w:r>
+              <w:t>Parameter</w:t>
+            </w:r>
+          </w:p>
+        </w:tc>
+        <w:tc>
+          <w:tcPr>
+            <w:tcW w:w="1320" w:type="dxa"/>
+          </w:tcPr>
+          <w:p>
+            <w:pPr>
+              <w:pStyle w:val="Compact"/>
+            </w:pPr>
+            <w:r>
+              <w:t>Min</w:t>
+            </w:r>
+          </w:p>
+        </w:tc>
+        <w:tc>
+          <w:tcPr>
+            <w:tcW w:w="2376" w:type="dxa"/>
+          </w:tcPr>
+          <w:p>
+            <w:pPr>
+              <w:pStyle w:val="Compact"/>
+            </w:pPr>
+            <w:r>
+              <w:t>Nominal</w:t>
+            </w:r>
+          </w:p>
+        </w:tc>
+        <w:tc>
+          <w:tcPr>
+            <w:tcW w:w="1320" w:type="dxa"/>
+          </w:tcPr>
+          <w:p>
+            <w:pPr>
+              <w:pStyle w:val="Compact"/>
+            </w:pPr>
+            <w:r>
+              <w:t>Max</w:t>
+            </w:r>
+          </w:p>
+        </w:tc>
+      </w:tr>
+      <w:tr>
+        <w:tc>
+          <w:tcPr>
+            <w:tcW w:w="2904" w:type="dxa"/>
+          </w:tcPr>
+          <w:p>
+            <w:pPr>
+              <w:pStyle w:val="Compact"/>
+            </w:pPr>
+            <m:oMath>
+              <m:sSub>
+                <m:sSubPr>
+                  <m:ctrlPr>
+                    <w:rPr>
+                      <w:rFonts w:ascii="Cambria Math" w:hAnsi="Cambria Math"/>
+                    </w:rPr>
+                  </m:ctrlPr>
+                </m:sSubPr>
+                <m:e>
+                  <m:r>
+                    <w:rPr>
+                      <w:rFonts w:ascii="Cambria Math" w:hAnsi="Cambria Math"/>
+                    </w:rPr>
+                    <m:t>R</m:t>
+                  </m:r>
+                </m:e>
+                <m:sub>
+                  <m:r>
+                    <w:rPr>
+                      <w:rFonts w:ascii="Cambria Math" w:hAnsi="Cambria Math"/>
+                    </w:rPr>
+                    <m:t>lower</m:t>
+                  </m:r>
+                </m:sub>
+              </m:sSub>
+            </m:oMath>
+            <w:r>
+              <w:t xml:space="preserve"> </w:t>
+            </w:r>
+          </w:p>
+        </w:tc>
+        <w:tc>
+          <w:tcPr>
+            <w:tcW w:w="1320" w:type="dxa"/>
+          </w:tcPr>
+          <w:p>
+            <w:pPr>
+              <w:pStyle w:val="Compact"/>
+            </w:pPr>
+            <m:oMath>
+              <m:r>
+                <w:rPr>
+                  <w:rFonts w:ascii="Cambria Math" w:hAnsi="Cambria Math"/>
+                </w:rPr>
+                <m:t>998</m:t>
+              </m:r>
+            </m:oMath>
+            <w:r>
+              <w:t xml:space="preserve"> </w:t>
+            </w:r>
+          </w:p>
+        </w:tc>
+        <w:tc>
+          <w:tcPr>
+            <w:tcW w:w="2376" w:type="dxa"/>
+          </w:tcPr>
+          <w:p>
+            <w:pPr>
+              <w:pStyle w:val="Compact"/>
+            </w:pPr>
+            <m:oMath>
+              <m:r>
+                <w:rPr>
+                  <w:rFonts w:ascii="Cambria Math" w:hAnsi="Cambria Math"/>
+                </w:rPr>
+                <m:t>1000</m:t>
+              </m:r>
+            </m:oMath>
+            <w:r>
+              <w:t xml:space="preserve"> </w:t>
+            </w:r>
+          </w:p>
+        </w:tc>
+        <w:tc>
+          <w:tcPr>
+            <w:tcW w:w="1320" w:type="dxa"/>
+          </w:tcPr>
+          <w:p>
+            <w:pPr>
+              <w:pStyle w:val="Compact"/>
+            </w:pPr>
+            <m:oMath>
+              <m:r>
+                <w:rPr>
+                  <w:rFonts w:ascii="Cambria Math" w:hAnsi="Cambria Math"/>
+                </w:rPr>
+                <m:t>1002</m:t>
+              </m:r>
+            </m:oMath>
+            <w:r>
+              <w:t xml:space="preserve"> </w:t>
+            </w:r>
+          </w:p>
+        </w:tc>
+      </w:tr>
+      <w:tr>
+        <w:tc>
+          <w:tcPr>
+            <w:tcW w:w="2904" w:type="dxa"/>
+          </w:tcPr>
+          <w:p>
+            <w:pPr>
+              <w:pStyle w:val="Compact"/>
+            </w:pPr>
+            <m:oMath>
+              <m:sSub>
+                <m:sSubPr>
+                  <m:ctrlPr>
+                    <w:rPr>
+                      <w:rFonts w:ascii="Cambria Math" w:hAnsi="Cambria Math"/>
+                    </w:rPr>
+                  </m:ctrlPr>
+                </m:sSubPr>
+                <m:e>
+                  <m:r>
+                    <w:rPr>
+                      <w:rFonts w:ascii="Cambria Math" w:hAnsi="Cambria Math"/>
+                    </w:rPr>
+                    <m:t>R</m:t>
+                  </m:r>
+                </m:e>
+                <m:sub>
+                  <m:r>
+                    <w:rPr>
+                      <w:rFonts w:ascii="Cambria Math" w:hAnsi="Cambria Math"/>
+                    </w:rPr>
+                    <m:t>upper</m:t>
+                  </m:r>
+                </m:sub>
+              </m:sSub>
+            </m:oMath>
+            <w:r>
+              <w:t xml:space="preserve"> </w:t>
+            </w:r>
+          </w:p>
+        </w:tc>
+        <w:tc>
+          <w:tcPr>
+            <w:tcW w:w="1320" w:type="dxa"/>
+          </w:tcPr>
+          <w:p>
+            <w:pPr>
+              <w:pStyle w:val="Compact"/>
+            </w:pPr>
+            <m:oMath>
+              <m:r>
+                <w:rPr>
+                  <w:rFonts w:ascii="Cambria Math" w:hAnsi="Cambria Math"/>
+                </w:rPr>
+                <m:t>3996</m:t>
+              </m:r>
+            </m:oMath>
+            <w:r>
+              <w:t xml:space="preserve"> </w:t>
+            </w:r>
+          </w:p>
+        </w:tc>
+        <w:tc>
+          <w:tcPr>
+            <w:tcW w:w="2376" w:type="dxa"/>
+          </w:tcPr>
+          <w:p>
+            <w:pPr>
+              <w:pStyle w:val="Compact"/>
+            </w:pPr>
+            <m:oMath>
+              <m:r>
+                <w:rPr>
+                  <w:rFonts w:ascii="Cambria Math" w:hAnsi="Cambria Math"/>
+                </w:rPr>
+                <m:t>4000</m:t>
+              </m:r>
+            </m:oMath>
+            <w:r>
+              <w:t xml:space="preserve"> </w:t>
+            </w:r>
+          </w:p>
+        </w:tc>
+        <w:tc>
+          <w:tcPr>
+            <w:tcW w:w="1320" w:type="dxa"/>
+          </w:tcPr>
+          <w:p>
+            <w:pPr>
+              <w:pStyle w:val="Compact"/>
+            </w:pPr>
+            <m:oMath>
+              <m:r>
+                <w:rPr>
+                  <w:rFonts w:ascii="Cambria Math" w:hAnsi="Cambria Math"/>
+                </w:rPr>
+                <m:t>4004</m:t>
+              </m:r>
+            </m:oMath>
+            <w:r>
+              <w:t xml:space="preserve"> </w:t>
+            </w:r>
+          </w:p>
+        </w:tc>
+      </w:tr>
+      <w:tr>
+        <w:tc>
+          <w:tcPr>
+            <w:tcW w:w="2904" w:type="dxa"/>
+          </w:tcPr>
+          <w:p>
+            <w:pPr>
+              <w:pStyle w:val="Compact"/>
+            </w:pPr>
+            <m:oMath>
+              <m:sSub>
+                <m:sSubPr>
+                  <m:ctrlPr>
+                    <w:rPr>
+                      <w:rFonts w:ascii="Cambria Math" w:hAnsi="Cambria Math"/>
+                    </w:rPr>
+                  </m:ctrlPr>
+                </m:sSubPr>
+                <m:e>
+                  <m:r>
+                    <w:rPr>
+                      <w:rFonts w:ascii="Cambria Math" w:hAnsi="Cambria Math"/>
+                    </w:rPr>
+                    <m:t>I</m:t>
+                  </m:r>
+                </m:e>
+                <m:sub>
+                  <m:r>
+                    <w:rPr>
+                      <w:rFonts w:ascii="Cambria Math" w:hAnsi="Cambria Math"/>
+                    </w:rPr>
+                    <m:t>B</m:t>
+                  </m:r>
+                </m:sub>
+              </m:sSub>
+            </m:oMath>
+            <w:r>
+              <w:t xml:space="preserve"> </w:t>
+            </w:r>
+          </w:p>
+        </w:tc>
+        <w:tc>
+          <w:tcPr>
+            <w:tcW w:w="1320" w:type="dxa"/>
+          </w:tcPr>
+          <w:p>
+            <w:pPr>
+              <w:pStyle w:val="Compact"/>
+            </w:pPr>
+            <m:oMath>
+              <m:r>
+                <m:rPr>
+                  <m:sty m:val="p"/>
+                </m:rPr>
+                <w:rPr>
+                  <w:rFonts w:ascii="Cambria Math" w:hAnsi="Cambria Math"/>
+                </w:rPr>
+                <m:t>-</m:t>
+              </m:r>
+              <m:r>
+                <w:rPr>
+                  <w:rFonts w:ascii="Cambria Math" w:hAnsi="Cambria Math"/>
+                </w:rPr>
+                <m:t>600</m:t>
+              </m:r>
+              <m:r>
+                <m:rPr>
+                  <m:sty m:val="p"/>
+                </m:rPr>
+                <w:rPr>
+                  <w:rFonts w:ascii="Cambria Math" w:hAnsi="Cambria Math"/>
+                </w:rPr>
+                <m:t>⋅</m:t>
+              </m:r>
+              <m:sSup>
+                <m:sSupPr>
+                  <m:ctrlPr>
+                    <w:rPr>
+                      <w:rFonts w:ascii="Cambria Math" w:hAnsi="Cambria Math"/>
+                    </w:rPr>
+                  </m:ctrlPr>
+                </m:sSupPr>
+                <m:e>
+                  <m:r>
+                    <w:rPr>
+                      <w:rFonts w:ascii="Cambria Math" w:hAnsi="Cambria Math"/>
+                    </w:rPr>
+                    <m:t>10</m:t>
+                  </m:r>
+                </m:e>
+                <m:sup>
+                  <m:r>
+                    <m:rPr>
+                      <m:sty m:val="p"/>
+                    </m:rPr>
+                    <w:rPr>
+                      <w:rFonts w:ascii="Cambria Math" w:hAnsi="Cambria Math"/>
+                    </w:rPr>
+                    <m:t>-</m:t>
+                  </m:r>
+                  <m:r>
+                    <w:rPr>
+                      <w:rFonts w:ascii="Cambria Math" w:hAnsi="Cambria Math"/>
+                    </w:rPr>
+                    <m:t>9</m:t>
+                  </m:r>
+                </m:sup>
+              </m:sSup>
+            </m:oMath>
+            <w:r>
+              <w:t xml:space="preserve"> </w:t>
+            </w:r>
+          </w:p>
+        </w:tc>
+        <w:tc>
+          <w:tcPr>
+            <w:tcW w:w="2376" w:type="dxa"/>
+          </w:tcPr>
+          <w:p>
+            <w:pPr>
+              <w:pStyle w:val="Compact"/>
+            </w:pPr>
+            <m:oMath>
+              <m:r>
+                <w:rPr>
+                  <w:rFonts w:ascii="Cambria Math" w:hAnsi="Cambria Math"/>
+                </w:rPr>
+                <m:t>0</m:t>
+              </m:r>
+            </m:oMath>
+            <w:r>
+              <w:t xml:space="preserve"> </w:t>
+            </w:r>
+          </w:p>
+        </w:tc>
+        <w:tc>
+          <w:tcPr>
+            <w:tcW w:w="1320" w:type="dxa"/>
+          </w:tcPr>
+          <w:p>
+            <w:pPr>
+              <w:pStyle w:val="Compact"/>
+            </w:pPr>
+            <m:oMath>
+              <m:r>
+                <w:rPr>
+                  <w:rFonts w:ascii="Cambria Math" w:hAnsi="Cambria Math"/>
+                </w:rPr>
+                <m:t>600</m:t>
+              </m:r>
+              <m:r>
+                <m:rPr>
+                  <m:sty m:val="p"/>
+                </m:rPr>
+                <w:rPr>
+                  <w:rFonts w:ascii="Cambria Math" w:hAnsi="Cambria Math"/>
+                </w:rPr>
+                <m:t>⋅</m:t>
+              </m:r>
+              <m:sSup>
+                <m:sSupPr>
+                  <m:ctrlPr>
+                    <w:rPr>
+                      <w:rFonts w:ascii="Cambria Math" w:hAnsi="Cambria Math"/>
+                    </w:rPr>
+                  </m:ctrlPr>
+                </m:sSupPr>
+                <m:e>
+                  <m:r>
+                    <w:rPr>
+                      <w:rFonts w:ascii="Cambria Math" w:hAnsi="Cambria Math"/>
+                    </w:rPr>
+                    <m:t>10</m:t>
+                  </m:r>
+                </m:e>
+                <m:sup>
+                  <m:r>
+                    <m:rPr>
+                      <m:sty m:val="p"/>
+                    </m:rPr>
+                    <w:rPr>
+                      <w:rFonts w:ascii="Cambria Math" w:hAnsi="Cambria Math"/>
+                    </w:rPr>
+                    <m:t>-</m:t>
+                  </m:r>
+                  <m:r>
+                    <w:rPr>
+                      <w:rFonts w:ascii="Cambria Math" w:hAnsi="Cambria Math"/>
+                    </w:rPr>
+                    <m:t>9</m:t>
+                  </m:r>
+                </m:sup>
+              </m:sSup>
+            </m:oMath>
+            <w:r>
+              <w:t xml:space="preserve"> </w:t>
+            </w:r>
+          </w:p>
+        </w:tc>
+      </w:tr>
+      <w:tr>
+        <w:tc>
+          <w:tcPr>
+            <w:tcW w:w="2904" w:type="dxa"/>
+          </w:tcPr>
+          <w:p>
+            <w:pPr>
+              <w:pStyle w:val="Compact"/>
+            </w:pPr>
+            <m:oMath>
+              <m:sSub>
+                <m:sSubPr>
+                  <m:ctrlPr>
+                    <w:rPr>
+                      <w:rFonts w:ascii="Cambria Math" w:hAnsi="Cambria Math"/>
+                    </w:rPr>
+                  </m:ctrlPr>
+                </m:sSubPr>
+                <m:e>
+                  <m:r>
+                    <w:rPr>
+                      <w:rFonts w:ascii="Cambria Math" w:hAnsi="Cambria Math"/>
+                    </w:rPr>
+                    <m:t>I</m:t>
+                  </m:r>
+                </m:e>
+                <m:sub>
+                  <m:r>
+                    <w:rPr>
+                      <w:rFonts w:ascii="Cambria Math" w:hAnsi="Cambria Math"/>
+                    </w:rPr>
+                    <m:t>OS</m:t>
+                  </m:r>
+                </m:sub>
+              </m:sSub>
+            </m:oMath>
+            <w:r>
+              <w:t xml:space="preserve"> </w:t>
+            </w:r>
+          </w:p>
+        </w:tc>
+        <w:tc>
+          <w:tcPr>
+            <w:tcW w:w="1320" w:type="dxa"/>
+          </w:tcPr>
+          <w:p>
+            <w:pPr>
+              <w:pStyle w:val="Compact"/>
+            </w:pPr>
+            <m:oMath>
+              <m:r>
+                <m:rPr>
+                  <m:sty m:val="p"/>
+                </m:rPr>
+                <w:rPr>
+                  <w:rFonts w:ascii="Cambria Math" w:hAnsi="Cambria Math"/>
+                </w:rPr>
+                <m:t>-</m:t>
+              </m:r>
+              <m:r>
+                <w:rPr>
+                  <w:rFonts w:ascii="Cambria Math" w:hAnsi="Cambria Math"/>
+                </w:rPr>
+                <m:t>100</m:t>
+              </m:r>
+              <m:r>
+                <m:rPr>
+                  <m:sty m:val="p"/>
+                </m:rPr>
+                <w:rPr>
+                  <w:rFonts w:ascii="Cambria Math" w:hAnsi="Cambria Math"/>
+                </w:rPr>
+                <m:t>⋅</m:t>
+              </m:r>
+              <m:sSup>
+                <m:sSupPr>
+                  <m:ctrlPr>
+                    <w:rPr>
+                      <w:rFonts w:ascii="Cambria Math" w:hAnsi="Cambria Math"/>
+                    </w:rPr>
+                  </m:ctrlPr>
+                </m:sSupPr>
+                <m:e>
+                  <m:r>
+                    <w:rPr>
+                      <w:rFonts w:ascii="Cambria Math" w:hAnsi="Cambria Math"/>
+                    </w:rPr>
+                    <m:t>10</m:t>
+                  </m:r>
+                </m:e>
+                <m:sup>
+                  <m:r>
+                    <m:rPr>
+                      <m:sty m:val="p"/>
+                    </m:rPr>
+                    <w:rPr>
+                      <w:rFonts w:ascii="Cambria Math" w:hAnsi="Cambria Math"/>
+                    </w:rPr>
+                    <m:t>-</m:t>
+                  </m:r>
+                  <m:r>
+                    <w:rPr>
+                      <w:rFonts w:ascii="Cambria Math" w:hAnsi="Cambria Math"/>
+                    </w:rPr>
+                    <m:t>9</m:t>
+                  </m:r>
+                </m:sup>
+              </m:sSup>
+            </m:oMath>
+            <w:r>
+              <w:t xml:space="preserve"> </w:t>
+            </w:r>
+          </w:p>
+        </w:tc>
+        <w:tc>
+          <w:tcPr>
+            <w:tcW w:w="2376" w:type="dxa"/>
+          </w:tcPr>
+          <w:p>
+            <w:pPr>
+              <w:pStyle w:val="Compact"/>
+            </w:pPr>
+            <m:oMath>
+              <m:r>
+                <w:rPr>
+                  <w:rFonts w:ascii="Cambria Math" w:hAnsi="Cambria Math"/>
+                </w:rPr>
+                <m:t>0</m:t>
+              </m:r>
+            </m:oMath>
+            <w:r>
+              <w:t xml:space="preserve"> </w:t>
+            </w:r>
+          </w:p>
+        </w:tc>
+        <w:tc>
+          <w:tcPr>
+            <w:tcW w:w="1320" w:type="dxa"/>
+          </w:tcPr>
+          <w:p>
+            <w:pPr>
+              <w:pStyle w:val="Compact"/>
+            </w:pPr>
+            <m:oMath>
+              <m:r>
+                <w:rPr>
+                  <w:rFonts w:ascii="Cambria Math" w:hAnsi="Cambria Math"/>
+                </w:rPr>
+                <m:t>100</m:t>
+              </m:r>
+              <m:r>
+                <m:rPr>
+                  <m:sty m:val="p"/>
+                </m:rPr>
+                <w:rPr>
+                  <w:rFonts w:ascii="Cambria Math" w:hAnsi="Cambria Math"/>
+                </w:rPr>
+                <m:t>⋅</m:t>
+              </m:r>
+              <m:sSup>
+                <m:sSupPr>
+                  <m:ctrlPr>
+                    <w:rPr>
+                      <w:rFonts w:ascii="Cambria Math" w:hAnsi="Cambria Math"/>
+                    </w:rPr>
+                  </m:ctrlPr>
+                </m:sSupPr>
+                <m:e>
+                  <m:r>
+                    <w:rPr>
+                      <w:rFonts w:ascii="Cambria Math" w:hAnsi="Cambria Math"/>
+                    </w:rPr>
+                    <m:t>10</m:t>
+                  </m:r>
+                </m:e>
+                <m:sup>
+                  <m:r>
+                    <m:rPr>
+                      <m:sty m:val="p"/>
+                    </m:rPr>
+                    <w:rPr>
+                      <w:rFonts w:ascii="Cambria Math" w:hAnsi="Cambria Math"/>
+                    </w:rPr>
+                    <m:t>-</m:t>
+                  </m:r>
+                  <m:r>
+                    <w:rPr>
+                      <w:rFonts w:ascii="Cambria Math" w:hAnsi="Cambria Math"/>
+                    </w:rPr>
+                    <m:t>9</m:t>
+                  </m:r>
+                </m:sup>
+              </m:sSup>
+            </m:oMath>
+            <w:r>
+              <w:t xml:space="preserve"> </w:t>
+            </w:r>
+          </w:p>
+        </w:tc>
+      </w:tr>
+      <w:tr>
+        <w:tc>
+          <w:tcPr>
+            <w:tcW w:w="2904" w:type="dxa"/>
+          </w:tcPr>
+          <w:p>
+            <w:pPr>
+              <w:pStyle w:val="Compact"/>
+            </w:pPr>
+            <m:oMath>
+              <m:sSub>
+                <m:sSubPr>
+                  <m:ctrlPr>
+                    <w:rPr>
+                      <w:rFonts w:ascii="Cambria Math" w:hAnsi="Cambria Math"/>
+                    </w:rPr>
+                  </m:ctrlPr>
+                </m:sSubPr>
+                <m:e>
+                  <m:r>
+                    <w:rPr>
+                      <w:rFonts w:ascii="Cambria Math" w:hAnsi="Cambria Math"/>
+                    </w:rPr>
+                    <m:t>V</m:t>
+                  </m:r>
+                </m:e>
+                <m:sub>
+                  <m:r>
+                    <w:rPr>
+                      <w:rFonts w:ascii="Cambria Math" w:hAnsi="Cambria Math"/>
+                    </w:rPr>
+                    <m:t>OS</m:t>
+                  </m:r>
+                </m:sub>
+              </m:sSub>
+            </m:oMath>
+            <w:r>
+              <w:t xml:space="preserve"> </w:t>
+            </w:r>
+          </w:p>
+        </w:tc>
+        <w:tc>
+          <w:tcPr>
+            <w:tcW w:w="1320" w:type="dxa"/>
+          </w:tcPr>
+          <w:p>
+            <w:pPr>
+              <w:pStyle w:val="Compact"/>
+            </w:pPr>
+            <m:oMath>
+              <m:r>
+                <m:rPr>
+                  <m:sty m:val="p"/>
+                </m:rPr>
+                <w:rPr>
+                  <w:rFonts w:ascii="Cambria Math" w:hAnsi="Cambria Math"/>
+                </w:rPr>
+                <m:t>-</m:t>
+              </m:r>
+              <m:r>
+                <w:rPr>
+                  <w:rFonts w:ascii="Cambria Math" w:hAnsi="Cambria Math"/>
+                </w:rPr>
+                <m:t>500</m:t>
+              </m:r>
+              <m:r>
+                <m:rPr>
+                  <m:sty m:val="p"/>
+                </m:rPr>
+                <w:rPr>
+                  <w:rFonts w:ascii="Cambria Math" w:hAnsi="Cambria Math"/>
+                </w:rPr>
+                <m:t>⋅</m:t>
+              </m:r>
+              <m:sSup>
+                <m:sSupPr>
+                  <m:ctrlPr>
+                    <w:rPr>
+                      <w:rFonts w:ascii="Cambria Math" w:hAnsi="Cambria Math"/>
+                    </w:rPr>
+                  </m:ctrlPr>
+                </m:sSupPr>
+                <m:e>
+                  <m:r>
+                    <w:rPr>
+                      <w:rFonts w:ascii="Cambria Math" w:hAnsi="Cambria Math"/>
+                    </w:rPr>
+                    <m:t>10</m:t>
+                  </m:r>
+                </m:e>
+                <m:sup>
+                  <m:r>
+                    <m:rPr>
+                      <m:sty m:val="p"/>
+                    </m:rPr>
+                    <w:rPr>
+                      <w:rFonts w:ascii="Cambria Math" w:hAnsi="Cambria Math"/>
+                    </w:rPr>
+                    <m:t>-</m:t>
+                  </m:r>
+                  <m:r>
+                    <w:rPr>
+                      <w:rFonts w:ascii="Cambria Math" w:hAnsi="Cambria Math"/>
+                    </w:rPr>
+                    <m:t>6</m:t>
+                  </m:r>
+                </m:sup>
+              </m:sSup>
+            </m:oMath>
+            <w:r>
+              <w:t xml:space="preserve"> </w:t>
+            </w:r>
+          </w:p>
+        </w:tc>
+        <w:tc>
+          <w:tcPr>
+            <w:tcW w:w="2376" w:type="dxa"/>
+          </w:tcPr>
+          <w:p>
+            <w:pPr>
+              <w:pStyle w:val="Compact"/>
+            </w:pPr>
+            <m:oMath>
+              <m:r>
+                <w:rPr>
+                  <w:rFonts w:ascii="Cambria Math" w:hAnsi="Cambria Math"/>
+                </w:rPr>
+                <m:t>0</m:t>
+              </m:r>
+            </m:oMath>
+            <w:r>
+              <w:t xml:space="preserve"> </w:t>
+            </w:r>
+          </w:p>
+        </w:tc>
+        <w:tc>
+          <w:tcPr>
+            <w:tcW w:w="1320" w:type="dxa"/>
+          </w:tcPr>
+          <w:p>
+            <w:pPr>
+              <w:pStyle w:val="Compact"/>
+            </w:pPr>
+            <m:oMath>
+              <m:r>
+                <w:rPr>
+                  <w:rFonts w:ascii="Cambria Math" w:hAnsi="Cambria Math"/>
+                </w:rPr>
+                <m:t>500</m:t>
+              </m:r>
+              <m:r>
+                <m:rPr>
+                  <m:sty m:val="p"/>
+                </m:rPr>
+                <w:rPr>
+                  <w:rFonts w:ascii="Cambria Math" w:hAnsi="Cambria Math"/>
+                </w:rPr>
+                <m:t>⋅</m:t>
+              </m:r>
+              <m:sSup>
+                <m:sSupPr>
+                  <m:ctrlPr>
+                    <w:rPr>
+                      <w:rFonts w:ascii="Cambria Math" w:hAnsi="Cambria Math"/>
+                    </w:rPr>
+                  </m:ctrlPr>
+                </m:sSupPr>
+                <m:e>
+                  <m:r>
+                    <w:rPr>
+                      <w:rFonts w:ascii="Cambria Math" w:hAnsi="Cambria Math"/>
+                    </w:rPr>
+                    <m:t>10</m:t>
+                  </m:r>
+                </m:e>
+                <m:sup>
+                  <m:r>
+                    <m:rPr>
+                      <m:sty m:val="p"/>
+                    </m:rPr>
+                    <w:rPr>
+                      <w:rFonts w:ascii="Cambria Math" w:hAnsi="Cambria Math"/>
+                    </w:rPr>
+                    <m:t>-</m:t>
+                  </m:r>
+                  <m:r>
+                    <w:rPr>
+                      <w:rFonts w:ascii="Cambria Math" w:hAnsi="Cambria Math"/>
+                    </w:rPr>
+                    <m:t>6</m:t>
+                  </m:r>
+                </m:sup>
+              </m:sSup>
+            </m:oMath>
+            <w:r>
+              <w:t xml:space="preserve"> </w:t>
+            </w:r>
+          </w:p>
+        </w:tc>
+      </w:tr>
+    </w:tbl>
+    <w:p>
+      <w:pPr>
+        <w:pStyle w:val="BodyText"/>
+      </w:pPr>
+      <w:r>
+        <w:t>Nominal: 5</w:t>
+      </w:r>
+    </w:p>
+    <w:p>
+      <w:pPr>
+        <w:pStyle w:val="BodyText"/>
+      </w:pPr>
+      <w:r>
+        <w:t>RSS Min: 4.9904</w:t>
+      </w:r>
+    </w:p>
+    <w:p>
+      <w:pPr>
+        <w:pStyle w:val="BodyText"/>
+      </w:pPr>
+      <w:r>
+        <w:t>RSS Max: 5.0096</w:t>
+      </w:r>
+    </w:p>
+    <w:p>
+      <w:pPr>
+        <w:pStyle w:val="BodyText"/>
+      </w:pPr>
+      <w:r>
+        <w:rPr>
+          <w:b/>
+          <w:bCs/>
+        </w:rPr>
+        <w:t>Sensitivity (% of RSS variance):</w:t>
+      </w:r>
+      <w:r>
+        <w:t xml:space="preserve"> - R_lower_as_variable: 69.6% - R_upper_as_variable: 17.3% </w:t>
+      </w:r>
+      <w:r>
+        <w:t>- V_OS_as_variable: 6.8% - I_B_as_variable: 6.2% - I_OS_as_variable: 0.0%</w:t>
+      </w:r>
       <w:bookmarkEnd w:id="0"/>
     </w:p>
     <w:sectPr>
@@ -1820,7 +2822,7 @@
   <w:abstractNum w:abstractNumId="0">
     <w:nsid w:val="0000A990"/>
     <w:multiLevelType w:val="multilevel"/>
-    <w:tmpl w:val="59E62344"/>
+    <w:tmpl w:val="4210CF98"/>
     <w:lvl w:ilvl="0">
       <w:numFmt w:val="bullet"/>
       <w:lvlText w:val=" "/>
@@ -2870,7 +3872,7 @@
     <w:name w:val="Balloon Text"/>
     <w:basedOn w:val="Normal"/>
     <w:link w:val="BalloonTextChar"/>
-    <w:rsid w:val="00132D7C"/>
+    <w:rsid w:val="002727F0"/>
     <w:pPr>
       <w:spacing w:after="0"/>
     </w:pPr>
@@ -2884,7 +3886,7 @@
     <w:name w:val="Balloon Text Char"/>
     <w:basedOn w:val="DefaultParagraphFont"/>
     <w:link w:val="BalloonText"/>
-    <w:rsid w:val="00132D7C"/>
+    <w:rsid w:val="002727F0"/>
     <w:rPr>
       <w:rFonts w:ascii="Tahoma" w:hAnsi="Tahoma" w:cs="Tahoma"/>
       <w:sz w:val="16"/>

</xml_diff>